<commit_message>
Highlight placeholders in red and unverified claims in yellow
Red marks only the placeholder text itself, split out of its
surrounding run, plus the template boilerplate carried over from the
cover and front matter. Yellow marks claims that rest on a single run,
depend on a citation whose details need checking, or state a limitation
that has not been measured. A legend explaining both colours sits
under the contents heading.

Co-Authored-By: Claude Opus 5 <noreply@anthropic.com>
</commit_message>
<xml_diff>
--- a/report/PerMFL_missing_sections.docx
+++ b/report/PerMFL_missing_sections.docx
@@ -210,6 +210,9 @@
         <w:jc w:val="center"/>
       </w:pPr>
       <w:r>
+        <w:rPr>
+          <w:highlight w:val="red"/>
+        </w:rPr>
         <w:t>Department of Computing and Mathematics</w:t>
       </w:r>
     </w:p>
@@ -240,6 +243,22 @@
           </w:pPr>
           <w:r>
             <w:t>Contents</w:t>
+          </w:r>
+        </w:p>
+        <w:p>
+          <w:pPr>
+            <w:pBdr>
+              <w:top w:val="single" w:sz="6" w:space="4" w:color="C00000"/>
+              <w:bottom w:val="single" w:sz="6" w:space="4" w:color="C00000"/>
+            </w:pBdr>
+            <w:spacing w:before="120" w:after="120"/>
+          </w:pPr>
+          <w:r>
+            <w:rPr>
+              <w:i/>
+              <w:sz w:val="18"/>
+            </w:rPr>
+            <w:t xml:space="preserve">Draft marking: text highlighted in RED is a placeholder that must be replaced before submission. Text highlighted in YELLOW is a claim that is either unverified, rests on a single run, or depends on a citation whose details need checking. Neither colour should survive into the final document.</w:t>
           </w:r>
         </w:p>
         <w:p>
@@ -544,6 +563,7 @@
           <w:hyperlink w:anchor="_Toc40899003" w:history="1">
             <w:r>
               <w:rPr>
+                <w:highlight w:val="red"/>
                 <w:rStyle w:val="Hyperlink"/>
                 <w:noProof/>
               </w:rPr>
@@ -788,6 +808,7 @@
           <w:hyperlink w:anchor="_Toc40899006" w:history="1">
             <w:r>
               <w:rPr>
+                <w:highlight w:val="red"/>
                 <w:rStyle w:val="Hyperlink"/>
                 <w:noProof/>
               </w:rPr>
@@ -933,6 +954,7 @@
           <w:hyperlink w:anchor="_Toc40899008" w:history="1">
             <w:r>
               <w:rPr>
+                <w:highlight w:val="red"/>
                 <w:rStyle w:val="Hyperlink"/>
                 <w:noProof/>
               </w:rPr>
@@ -1060,6 +1082,9 @@
         <w:tab/>
       </w:r>
       <w:r>
+        <w:rPr>
+          <w:highlight w:val="red"/>
+        </w:rPr>
         <w:t>Quality measurements used by CQA . . . . . . . . . . . . . . . . . .</w:t>
       </w:r>
       <w:r>
@@ -1108,6 +1133,9 @@
         <w:t>1.1</w:t>
       </w:r>
       <w:r>
+        <w:rPr>
+          <w:highlight w:val="red"/>
+        </w:rPr>
         <w:tab/>
         <w:t>Transform coding. . . . . . . . . . . . . . . . . . . . . . . . . . . . .</w:t>
       </w:r>
@@ -1136,6 +1164,9 @@
         <w:ind w:left="-5" w:right="14"/>
       </w:pPr>
       <w:r>
+        <w:rPr>
+          <w:highlight w:val="red"/>
+        </w:rPr>
         <w:t>The abstract is a formal description of the reason for doing this</w:t>
       </w:r>
       <w:r>
@@ -1291,6 +1322,9 @@
         <w:t>PCA</w:t>
       </w:r>
       <w:r>
+        <w:rPr>
+          <w:highlight w:val="red"/>
+        </w:rPr>
         <w:tab/>
         <w:t>Principal Components Analysis</w:t>
       </w:r>
@@ -2207,7 +2241,16 @@
     <w:p>
       <w:pPr/>
       <w:r>
-        <w:t xml:space="preserve">The project involves no human participants, no personal data as defined by UK GDPR, and no interaction with live systems. Approval was obtained under reference [TO SUPPLY: EthOS number].</w:t>
+        <w:t xml:space="preserve">The project involves no human participants, no personal data as defined by UK GDPR, and no interaction with live systems. Approval was obtained under reference </w:t>
+      </w:r>
+      <w:r>
+        <w:rPr>
+          <w:highlight w:val="red"/>
+        </w:rPr>
+        <w:t xml:space="preserve">[TO SUPPLY: EthOS number]</w:t>
+      </w:r>
+      <w:r>
+        <w:t xml:space="preserve">.</w:t>
       </w:r>
     </w:p>
     <w:p>
@@ -2328,6 +2371,9 @@
     <w:p>
       <w:pPr/>
       <w:r>
+        <w:rPr>
+          <w:highlight w:val="yellow"/>
+        </w:rPr>
         <w:t xml:space="preserve">This matters more than a sanity check. The run carries the argument binding defect, since it is present in the released code, and it still lands on the published figure. That is evidence the defect was present when the paper's results were produced, and it licenses treating later measurements as changes to the method rather than symptoms of a broken build.</w:t>
       </w:r>
     </w:p>
@@ -2625,6 +2671,9 @@
     <w:p>
       <w:pPr/>
       <w:r>
+        <w:rPr>
+          <w:highlight w:val="yellow"/>
+        </w:rPr>
         <w:t xml:space="preserve">The comparison against other methods is absent. Neither SCMoE-PFL nor CFMD-i publishes an implementation, so no relative claim about accuracy or efficiency is made. Runs completed in minutes on one CPU core where a mixture-of-experts implementation required hours on a GPU, but the client counts, datasets and software stacks differ, so that observation is structural rather than measured.</w:t>
       </w:r>
     </w:p>
@@ -2637,12 +2686,18 @@
     <w:p>
       <w:pPr/>
       <w:r>
+        <w:rPr>
+          <w:highlight w:val="yellow"/>
+        </w:rPr>
         <w:t xml:space="preserve">Several exploratory results rest on single runs. The local depth and communication sweeps are reported as exploratory for that reason, though their effects, up to 0.29 macro F1, are far outside the noise floor.</w:t>
       </w:r>
     </w:p>
     <w:p>
       <w:pPr/>
       <w:r>
+        <w:rPr>
+          <w:highlight w:val="yellow"/>
+        </w:rPr>
         <w:t xml:space="preserve">The clustering signal is parameter-space only. CFMD-i additionally uses an output-space divergence, which is likely the better signal under label skew, since two clients can hold near-identical weights and behave differently. Given that the term the clustering feeds is weighted at 3.3 per cent, a better signal would probably not change the conclusion, but that is an argument rather than a measurement.</w:t>
       </w:r>
     </w:p>
@@ -2667,6 +2722,9 @@
     <w:p>
       <w:pPr/>
       <w:r>
+        <w:rPr>
+          <w:highlight w:val="yellow"/>
+        </w:rPr>
         <w:t xml:space="preserve">The structural ceiling calculation assumes a client can only predict classes it trained on. A model that generalises across classes could exceed it, so the bound is conservative rather than exact.</w:t>
       </w:r>
     </w:p>

</xml_diff>

<commit_message>
Rebuild missing-sections docx cleanly from source
It had been re-highlighted over an already-highlighted file. Rebuilt
from draft_source_missing.md; verified no double-wrapped runs in either
document.

Co-Authored-By: Claude Opus 5 <noreply@anthropic.com>
</commit_message>
<xml_diff>
--- a/report/PerMFL_missing_sections.docx
+++ b/report/PerMFL_missing_sections.docx
@@ -243,22 +243,6 @@
           </w:pPr>
           <w:r>
             <w:t>Contents</w:t>
-          </w:r>
-        </w:p>
-        <w:p>
-          <w:pPr>
-            <w:pBdr>
-              <w:top w:val="single" w:sz="6" w:space="4" w:color="C00000"/>
-              <w:bottom w:val="single" w:sz="6" w:space="4" w:color="C00000"/>
-            </w:pBdr>
-            <w:spacing w:before="120" w:after="120"/>
-          </w:pPr>
-          <w:r>
-            <w:rPr>
-              <w:i/>
-              <w:sz w:val="18"/>
-            </w:rPr>
-            <w:t xml:space="preserve">Draft marking: text highlighted in RED is a placeholder that must be replaced before submission. Text highlighted in YELLOW is a claim that is either unverified, rests on a single run, or depends on a citation whose details need checking. Neither colour should survive into the final document.</w:t>
           </w:r>
         </w:p>
         <w:p>
@@ -2261,7 +2245,6 @@
       </w:r>
       <w:r>
         <w:rPr>
-          <w:highlight w:val="red"/>
           <w:highlight w:val="red"/>
         </w:rPr>
         <w:t xml:space="preserve">[TO SUPPLY: EthOS number]</w:t>

</xml_diff>

<commit_message>
Finish the terminology pass in the missing-sections source
Two remaining uses of shipped, both meaning the released code rather
than an experimental arm.

Co-Authored-By: Claude Opus 5 <noreply@anthropic.com>
</commit_message>
<xml_diff>
--- a/report/PerMFL_missing_sections.docx
+++ b/report/PerMFL_missing_sections.docx
@@ -2161,7 +2161,7 @@
         <w:t xml:space="preserve">N4 Backward compatibility.</w:t>
       </w:r>
       <w:r>
-        <w:t xml:space="preserve">  Every modification defaults to the shipped</w:t>
+        <w:t xml:space="preserve">  Every modification defaults to the released</w:t>
       </w:r>
     </w:p>
     <w:p>
@@ -2680,7 +2680,7 @@
     <w:p>
       <w:pPr/>
       <w:r>
-        <w:t xml:space="preserve">The baselines shipped with the base implementation were not run on the intrusion detection data. Only the method under test carries the metric instrumentation this study requires, and extending it to the others was not completed. The consequence is that the results position PerMFL against its own configurations and against local training, not against the federated literature.</w:t>
+        <w:t xml:space="preserve">The baselines released with the base implementation were not run on the intrusion detection data. Only the method under test carries the metric instrumentation this study requires, and extending it to the others was not completed. The consequence is that the results position PerMFL against its own configurations and against local training, not against the federated literature.</w:t>
       </w:r>
     </w:p>
     <w:p>

</xml_diff>